<commit_message>
test(fixtures): align manifest with DocumentKind and make fixture builds byte-stable
Review fixes: document_kind now uses the app's enum values, invoice 7's
assessment number is nulled because it only appears inside the prose
validation note (kept under its own key), the invented 'Validation note'
heading paragraph is removed so the fixture stays verbatim, assessment_ref
is present on every manifest entry, and zip member timestamps are fixed so
rerunning the builder produces byte-identical files.

Co-Authored-By: Claude Fable 5.1 <noreply@anthropic.com>
</commit_message>
<xml_diff>
--- a/sample-data/client-formats/DL_Repair_Invoice_format_7.docx
+++ b/sample-data/client-formats/DL_Repair_Invoice_format_7.docx
@@ -931,14 +931,6 @@
     </w:p>
     <w:p>
       <w:r>
-        <w:rPr>
-          <w:b w:val="0"/>
-        </w:rPr>
-        <w:t>Validation note</w:t>
-      </w:r>
-    </w:p>
-    <w:p>
-      <w:r>
         <w:t>Validation note: Verified against Assessment T4592861 / Claim Reference 426953180/3 for Oliver Reed. All invoice fields and breakups match exactly: Parts line items total £907.70 plus Sundry Parts £31.30 = Total Parts £939.00; Specialist Operations total £104.00; Total Labour £1,910.00; Total Paint / Materials Costs £785.00; VAT £747.60; Invoice Total / Total Due £4,485.60.</w:t>
       </w:r>
     </w:p>

</xml_diff>